<commit_message>
Terms of Service: aktualizácia podľa reálneho fungovania appky + PDF/DOCX
- skúšobná doba 31 dní, po opätovnom pripojení Stravy 30 dní histórie
- AI: len vlastné dáta, žiadne trénovanie modelov (ani dát zo Stravy)
- dáta zo Stravy vidí len user, nezávislosť od Strava/Garmin
- pravidlá používania, 16+, limity AI, ceny len v appke vrátane DPH
- Privacy: oprava doby uchovania súhrnov aktivít (nie 90 dní)
- tooltip dnešných aktivít bez zmienky o trase (mapy neukladáme)

Co-Authored-By: Claude Opus 5.5 <noreply@anthropic.com>
Claude-Session: https://claude.ai/code/session_012NdhdwxGwmFSuvzwk8rwCy
</commit_message>
<xml_diff>
--- a/frontend/public/documents/PrivacyPolicy_SelfRace_EN.docx
+++ b/frontend/public/documents/PrivacyPolicy_SelfRace_EN.docx
@@ -23,7 +23,7 @@
           <w:b w:val="false"/>
           <w:bCs w:val="false"/>
         </w:rPr>
-        <w:t xml:space="preserve">Last updated: October 5, 2026</w:t>
+        <w:t xml:space="preserve">Last updated: October 6, 2026</w:t>
       </w:r>
     </w:p>
     <w:p>
@@ -861,7 +861,7 @@
           <w:b w:val="false"/>
           <w:bCs w:val="false"/>
         </w:rPr>
-        <w:t xml:space="preserve">High-level activity metadata (summaries) is stored for up to 90 days to support long-term performance trend calculations (e.g., CTL/ATL).</w:t>
+        <w:t xml:space="preserve">High-level activity metadata (summaries – date, sport, duration, distance, heart rate) is stored while your Strava account is connected and your SelfRace account is active. It is used for long-term trends (e.g. CTL/ATL, training streaks, monthly reviews). On first connection we import at most the last 12 months.</w:t>
       </w:r>
     </w:p>
     <w:p>

</xml_diff>